<commit_message>
Frame research questions as general dataset merging with DR as case study; add image-property question
Co-Authored-By: Claude Sonnet 5.5 <noreply@anthropic.com>
Claude-Session: https://claude.ai/code/session_01Mrmk7xtGXEASaZHBUGuSEF
</commit_message>
<xml_diff>
--- a/Progress_Report.docx
+++ b/Progress_Report.docx
@@ -204,7 +204,7 @@
         <w:pStyle w:val="Compact"/>
       </w:pPr>
       <w:r>
-        <w:t xml:space="preserve">Early DR (grades 1-2) is symptomless and under-studied; much well-known work targets referable DR (moderate or worse).</w:t>
+        <w:t xml:space="preserve">Public medical-image datasets are often pooled to get more training data; here DDR, EyePACS and APTOS. A 2025 review notes that multi-dataset training can mask poor external generalization.</w:t>
       </w:r>
     </w:p>
     <w:p>
@@ -216,7 +216,7 @@
         <w:pStyle w:val="Compact"/>
       </w:pPr>
       <w:r>
-        <w:t xml:space="preserve">Public datasets are often pooled; a 2025 review notes that multi-dataset training can mask poor external generalization.</w:t>
+        <w:t xml:space="preserve">In other fields, models have learned hospital or scanner site, or dataset identity, instead of disease (Torralba and Efros 2011; Geirhos et al. 2020; Zech et al. 2018; DeGrave et al. 2021).</w:t>
       </w:r>
     </w:p>
     <w:p>
@@ -228,7 +228,19 @@
         <w:pStyle w:val="Compact"/>
       </w:pPr>
       <w:r>
-        <w:t xml:space="preserve">In three quick searches I found no study that tests whether a merged model learns the disease or the source, or that reports early-DR sensitivity at a pre-set specificity. A systematic literature search is still to do, so this is not a novelty claim.</w:t>
+        <w:t xml:space="preserve">Early DR (grades 1-2) is symptomless and under-studied; much well-known work targets referable DR (moderate or worse).</w:t>
+      </w:r>
+    </w:p>
+    <w:p>
+      <w:pPr>
+        <w:numPr>
+          <w:ilvl w:val="0"/>
+          <w:numId w:val="1001"/>
+        </w:numPr>
+        <w:pStyle w:val="Compact"/>
+      </w:pPr>
+      <w:r>
+        <w:t xml:space="preserve">In three quick searches I found no study that tests whether a merged early-DR model learns the disease or the source, which image properties carry the source, or that reports early-DR sensitivity at a pre-set specificity. A systematic literature search is still to do, so this is not a novelty claim.</w:t>
       </w:r>
     </w:p>
     <w:bookmarkEnd w:id="21"/>
@@ -239,6 +251,14 @@
       </w:pPr>
       <w:r>
         <w:t xml:space="preserve">3. Research questions</w:t>
+      </w:r>
+    </w:p>
+    <w:p>
+      <w:pPr>
+        <w:pStyle w:val="FirstParagraph"/>
+      </w:pPr>
+      <w:r>
+        <w:t xml:space="preserve">Dataset merging is treated in general, with early DR as the case study.</w:t>
       </w:r>
     </w:p>
     <w:p>
@@ -260,7 +280,7 @@
         <w:t xml:space="preserve"> </w:t>
       </w:r>
       <w:r>
-        <w:t xml:space="preserve">when datasets are merged for early-DR detection, does the model learn the disease or the source?</w:t>
+        <w:t xml:space="preserve">when medical-image datasets are merged, does a model learn the condition or the source?</w:t>
       </w:r>
     </w:p>
     <w:p>
@@ -276,13 +296,13 @@
           <w:bCs/>
           <w:b/>
         </w:rPr>
-        <w:t xml:space="preserve">RQ1:</w:t>
-      </w:r>
-      <w:r>
-        <w:t xml:space="preserve"> </w:t>
-      </w:r>
-      <w:r>
-        <w:t xml:space="preserve">does adding EyePACS to DDR improve early-DR sensitivity at a fixed specificity on unseen sources?</w:t>
+        <w:t xml:space="preserve">RQ1 (the merge):</w:t>
+      </w:r>
+      <w:r>
+        <w:t xml:space="preserve"> </w:t>
+      </w:r>
+      <w:r>
+        <w:t xml:space="preserve">does adding a second source (EyePACS to DDR) improve early-DR sensitivity at a fixed specificity on unseen sources?</w:t>
       </w:r>
     </w:p>
     <w:p>
@@ -298,7 +318,7 @@
           <w:bCs/>
           <w:b/>
         </w:rPr>
-        <w:t xml:space="preserve">RQ2:</w:t>
+        <w:t xml:space="preserve">RQ2 (the threshold):</w:t>
       </w:r>
       <w:r>
         <w:t xml:space="preserve"> </w:t>
@@ -320,13 +340,13 @@
           <w:bCs/>
           <w:b/>
         </w:rPr>
-        <w:t xml:space="preserve">RQ3:</w:t>
-      </w:r>
-      <w:r>
-        <w:t xml:space="preserve"> </w:t>
-      </w:r>
-      <w:r>
-        <w:t xml:space="preserve">do external benchmarks carry capture cues, such as image size, that a model could use instead of disease?</w:t>
+        <w:t xml:space="preserve">RQ3 (image properties):</w:t>
+      </w:r>
+      <w:r>
+        <w:t xml:space="preserve"> </w:t>
+      </w:r>
+      <w:r>
+        <w:t xml:space="preserve">which properties differ between sources (size, file size and quality, brightness, colour, sharpness; camera proxies, since the camera model is not recorded) and how do they affect what a merged model learns?</w:t>
       </w:r>
     </w:p>
     <w:bookmarkEnd w:id="22"/>
@@ -1227,7 +1247,7 @@
           <w:bCs/>
           <w:b/>
         </w:rPr>
-        <w:t xml:space="preserve">Image properties.</w:t>
+        <w:t xml:space="preserve">Image properties (first step of RQ3).</w:t>
       </w:r>
       <w:r>
         <w:t xml:space="preserve"> </w:t>
@@ -1414,6 +1434,32 @@
               <w:jc w:val="left"/>
             </w:pPr>
             <w:r>
+              <w:t xml:space="preserve">Property analysis for RQ3: source prediction from properties, scores within brightness, quality and sharpness strata, normalisation tests</w:t>
+            </w:r>
+          </w:p>
+        </w:tc>
+        <w:tc>
+          <w:tcPr/>
+          <w:p>
+            <w:pPr>
+              <w:pStyle w:val="Compact"/>
+              <w:jc w:val="left"/>
+            </w:pPr>
+            <w:r>
+              <w:t xml:space="preserve">To do (size strata done)</w:t>
+            </w:r>
+          </w:p>
+        </w:tc>
+      </w:tr>
+      <w:tr>
+        <w:tc>
+          <w:tcPr/>
+          <w:p>
+            <w:pPr>
+              <w:pStyle w:val="Compact"/>
+              <w:jc w:val="left"/>
+            </w:pPr>
+            <w:r>
               <w:t xml:space="preserve">Matched-subset check on APTOS (other capture cues)</w:t>
             </w:r>
           </w:p>
@@ -1564,7 +1610,46 @@
         <w:t xml:space="preserve">Information Sciences</w:t>
       </w:r>
       <w:r>
-        <w:t xml:space="preserve">, 2019. Kaggle EyePACS (2015) and APTOS 2019. Guo, C., et al., On calibration of modern neural networks, ICML, 2017. Tan, M., &amp; Le, Q., EfficientNet, ICML, 2019.</w:t>
+        <w:t xml:space="preserve">, 2019. Kaggle EyePACS (2015) and APTOS 2019. Guo, C., et al., On calibration of modern neural networks, ICML, 2017. Tan, M., &amp; Le, Q., EfficientNet, ICML, 2019. Torralba, A., &amp; Efros, A., Unbiased look at dataset bias, CVPR, 2011. Geirhos, R., et al., Shortcut learning in deep neural networks,</w:t>
+      </w:r>
+      <w:r>
+        <w:t xml:space="preserve"> </w:t>
+      </w:r>
+      <w:r>
+        <w:rPr>
+          <w:iCs/>
+          <w:i/>
+        </w:rPr>
+        <w:t xml:space="preserve">Nature Machine Intelligence</w:t>
+      </w:r>
+      <w:r>
+        <w:t xml:space="preserve">, 2020. Zech, J. R., et al.,</w:t>
+      </w:r>
+      <w:r>
+        <w:t xml:space="preserve"> </w:t>
+      </w:r>
+      <w:r>
+        <w:rPr>
+          <w:iCs/>
+          <w:i/>
+        </w:rPr>
+        <w:t xml:space="preserve">PLOS Medicine</w:t>
+      </w:r>
+      <w:r>
+        <w:t xml:space="preserve">, 2018. DeGrave, A. J., et al.,</w:t>
+      </w:r>
+      <w:r>
+        <w:t xml:space="preserve"> </w:t>
+      </w:r>
+      <w:r>
+        <w:rPr>
+          <w:iCs/>
+          <w:i/>
+        </w:rPr>
+        <w:t xml:space="preserve">Nature Machine Intelligence</w:t>
+      </w:r>
+      <w:r>
+        <w:t xml:space="preserve">, 2021.</w:t>
       </w:r>
       <w:r>
         <w:t xml:space="preserve"> </w:t>

</xml_diff>

<commit_message>
Fill group-split results (3 seeds) in decks, scripts and report; rename progress deck
Co-Authored-By: Claude Sonnet 5.5 <noreply@anthropic.com>
Claude-Session: https://claude.ai/code/session_01Mrmk7xtGXEASaZHBUGuSEF
</commit_message>
<xml_diff>
--- a/Progress_Report.docx
+++ b/Progress_Report.docx
@@ -166,23 +166,7 @@
         <w:pStyle w:val="FirstParagraph"/>
       </w:pPr>
       <w:r>
-        <w:t xml:space="preserve">This project asks whether models trained on merged diabetic retinopathy (DR) datasets learn the disease or the dataset they came from, for early DR (grades 1-2 versus No DR) at a fixed specificity. The full pipeline runs on Kaggle with three public datasets (DDR, EyePACS, APTOS). Results so far show that a naive merge teaches the source, that a source-balanced merge helps on unseen patients, and that in-domain scores are optimistic. Items marked</w:t>
-      </w:r>
-      <w:r>
-        <w:t xml:space="preserve"> </w:t>
-      </w:r>
-      <w:r>
-        <w:rPr>
-          <w:bCs/>
-          <w:b/>
-        </w:rPr>
-        <w:t xml:space="preserve">[FILL]</w:t>
-      </w:r>
-      <w:r>
-        <w:t xml:space="preserve"> </w:t>
-      </w:r>
-      <w:r>
-        <w:t xml:space="preserve">depend on the five-seed run and must be completed before submitting.</w:t>
+        <w:t xml:space="preserve">This project asks whether models trained on merged diabetic retinopathy (DR) datasets learn the disease or the dataset they came from, for early DR (grades 1-2 versus No DR) at a fixed specificity. The full pipeline runs on Kaggle with three public datasets (DDR, EyePACS, APTOS). Results so far show that a naive merge teaches the source, that a source-balanced merge helps on unseen patients, and that in-domain scores are optimistic. Group-split results are over three seeds; ECE, Brier and patient-level intervals are still to report.</w:t>
       </w:r>
     </w:p>
     <w:bookmarkEnd w:id="20"/>
@@ -621,20 +605,7 @@
         <w:pStyle w:val="Compact"/>
       </w:pPr>
       <w:r>
-        <w:t xml:space="preserve">Arms A, B and C: original run with three seeds; group-split run with five seeds</w:t>
-      </w:r>
-      <w:r>
-        <w:t xml:space="preserve"> </w:t>
-      </w:r>
-      <w:r>
-        <w:rPr>
-          <w:bCs/>
-          <w:b/>
-        </w:rPr>
-        <w:t xml:space="preserve">[FILL: confirm completed]</w:t>
-      </w:r>
-      <w:r>
-        <w:t xml:space="preserve">.</w:t>
+        <w:t xml:space="preserve">Arms A, B and C: original run and group-split run, three seeds each (42, 43, 44), evaluated.</w:t>
       </w:r>
     </w:p>
     <w:p>
@@ -863,32 +834,19 @@
           <w:bCs/>
           <w:b/>
         </w:rPr>
-        <w:t xml:space="preserve">Five-seed results</w:t>
-      </w:r>
-      <w:r>
-        <w:t xml:space="preserve"> </w:t>
-      </w:r>
-      <w:r>
-        <w:t xml:space="preserve">(mean and 95% patient-level bootstrap interval, group-split models)</w:t>
-      </w:r>
-      <w:r>
-        <w:t xml:space="preserve"> </w:t>
-      </w:r>
-      <w:r>
-        <w:rPr>
-          <w:bCs/>
-          <w:b/>
-        </w:rPr>
-        <w:t xml:space="preserve">[FILL from the evaluation output]</w:t>
-      </w:r>
-      <w:r>
-        <w:t xml:space="preserve">:</w:t>
+        <w:t xml:space="preserve">Group-split results</w:t>
+      </w:r>
+      <w:r>
+        <w:t xml:space="preserve"> </w:t>
+      </w:r>
+      <w:r>
+        <w:t xml:space="preserve">(mean ± sd over seeds 42, 43, 44; group-aware DDR split; EyePACS and APTOS unchanged):</w:t>
       </w:r>
     </w:p>
     <w:tbl>
       <w:tblPr>
         <w:tblStyle w:val="Table"/>
-        <w:tblW w:type="auto" w:w="0"/>
+        <w:tblW w:type="pct" w:w="5000"/>
         <w:tblLook w:firstRow="1" w:lastRow="0" w:firstColumn="0" w:lastColumn="0" w:noHBand="0" w:noVBand="0" w:val="0020"/>
         <w:jc w:val="start"/>
       </w:tblPr>
@@ -960,43 +918,43 @@
               <w:jc w:val="left"/>
             </w:pPr>
             <w:r>
-              <w:t xml:space="preserve">DDR: sensitivity at specificity 0.90</w:t>
-            </w:r>
-          </w:p>
-        </w:tc>
-        <w:tc>
-          <w:tcPr/>
-          <w:p>
-            <w:pPr>
-              <w:pStyle w:val="Compact"/>
-              <w:jc w:val="left"/>
-            </w:pPr>
-            <w:r>
-              <w:t xml:space="preserve">[ ]</w:t>
-            </w:r>
-          </w:p>
-        </w:tc>
-        <w:tc>
-          <w:tcPr/>
-          <w:p>
-            <w:pPr>
-              <w:pStyle w:val="Compact"/>
-              <w:jc w:val="left"/>
-            </w:pPr>
-            <w:r>
-              <w:t xml:space="preserve">[ ]</w:t>
-            </w:r>
-          </w:p>
-        </w:tc>
-        <w:tc>
-          <w:tcPr/>
-          <w:p>
-            <w:pPr>
-              <w:pStyle w:val="Compact"/>
-              <w:jc w:val="left"/>
-            </w:pPr>
-            <w:r>
-              <w:t xml:space="preserve">[ ]</w:t>
+              <w:t xml:space="preserve">DDR: sensitivity at frozen threshold</w:t>
+            </w:r>
+          </w:p>
+        </w:tc>
+        <w:tc>
+          <w:tcPr/>
+          <w:p>
+            <w:pPr>
+              <w:pStyle w:val="Compact"/>
+              <w:jc w:val="left"/>
+            </w:pPr>
+            <w:r>
+              <w:t xml:space="preserve">0.941 ± 0.009</w:t>
+            </w:r>
+          </w:p>
+        </w:tc>
+        <w:tc>
+          <w:tcPr/>
+          <w:p>
+            <w:pPr>
+              <w:pStyle w:val="Compact"/>
+              <w:jc w:val="left"/>
+            </w:pPr>
+            <w:r>
+              <w:t xml:space="preserve">0.925 ± 0.004</w:t>
+            </w:r>
+          </w:p>
+        </w:tc>
+        <w:tc>
+          <w:tcPr/>
+          <w:p>
+            <w:pPr>
+              <w:pStyle w:val="Compact"/>
+              <w:jc w:val="left"/>
+            </w:pPr>
+            <w:r>
+              <w:t xml:space="preserve">0.938 ± 0.005</w:t>
             </w:r>
           </w:p>
         </w:tc>
@@ -1022,31 +980,31 @@
               <w:jc w:val="left"/>
             </w:pPr>
             <w:r>
-              <w:t xml:space="preserve">[ ]</w:t>
-            </w:r>
-          </w:p>
-        </w:tc>
-        <w:tc>
-          <w:tcPr/>
-          <w:p>
-            <w:pPr>
-              <w:pStyle w:val="Compact"/>
-              <w:jc w:val="left"/>
-            </w:pPr>
-            <w:r>
-              <w:t xml:space="preserve">[ ]</w:t>
-            </w:r>
-          </w:p>
-        </w:tc>
-        <w:tc>
-          <w:tcPr/>
-          <w:p>
-            <w:pPr>
-              <w:pStyle w:val="Compact"/>
-              <w:jc w:val="left"/>
-            </w:pPr>
-            <w:r>
-              <w:t xml:space="preserve">[ ]</w:t>
+              <w:t xml:space="preserve">0.780 ± 0.006</w:t>
+            </w:r>
+          </w:p>
+        </w:tc>
+        <w:tc>
+          <w:tcPr/>
+          <w:p>
+            <w:pPr>
+              <w:pStyle w:val="Compact"/>
+              <w:jc w:val="left"/>
+            </w:pPr>
+            <w:r>
+              <w:t xml:space="preserve">0.884 ± 0.002</w:t>
+            </w:r>
+          </w:p>
+        </w:tc>
+        <w:tc>
+          <w:tcPr/>
+          <w:p>
+            <w:pPr>
+              <w:pStyle w:val="Compact"/>
+              <w:jc w:val="left"/>
+            </w:pPr>
+            <w:r>
+              <w:t xml:space="preserve">0.717 ± 0.011</w:t>
             </w:r>
           </w:p>
         </w:tc>
@@ -1072,31 +1030,31 @@
               <w:jc w:val="left"/>
             </w:pPr>
             <w:r>
-              <w:t xml:space="preserve">[ ]</w:t>
-            </w:r>
-          </w:p>
-        </w:tc>
-        <w:tc>
-          <w:tcPr/>
-          <w:p>
-            <w:pPr>
-              <w:pStyle w:val="Compact"/>
-              <w:jc w:val="left"/>
-            </w:pPr>
-            <w:r>
-              <w:t xml:space="preserve">[ ]</w:t>
-            </w:r>
-          </w:p>
-        </w:tc>
-        <w:tc>
-          <w:tcPr/>
-          <w:p>
-            <w:pPr>
-              <w:pStyle w:val="Compact"/>
-              <w:jc w:val="left"/>
-            </w:pPr>
-            <w:r>
-              <w:t xml:space="preserve">[ ]</w:t>
+              <w:t xml:space="preserve">0.438 ± 0.019</w:t>
+            </w:r>
+          </w:p>
+        </w:tc>
+        <w:tc>
+          <w:tcPr/>
+          <w:p>
+            <w:pPr>
+              <w:pStyle w:val="Compact"/>
+              <w:jc w:val="left"/>
+            </w:pPr>
+            <w:r>
+              <w:t xml:space="preserve">0.898 ± 0.004</w:t>
+            </w:r>
+          </w:p>
+        </w:tc>
+        <w:tc>
+          <w:tcPr/>
+          <w:p>
+            <w:pPr>
+              <w:pStyle w:val="Compact"/>
+              <w:jc w:val="left"/>
+            </w:pPr>
+            <w:r>
+              <w:t xml:space="preserve">0.008 ± 0.001</w:t>
             </w:r>
           </w:p>
         </w:tc>
@@ -1122,31 +1080,31 @@
               <w:jc w:val="left"/>
             </w:pPr>
             <w:r>
-              <w:t xml:space="preserve">[ ]</w:t>
-            </w:r>
-          </w:p>
-        </w:tc>
-        <w:tc>
-          <w:tcPr/>
-          <w:p>
-            <w:pPr>
-              <w:pStyle w:val="Compact"/>
-              <w:jc w:val="left"/>
-            </w:pPr>
-            <w:r>
-              <w:t xml:space="preserve">[ ]</w:t>
-            </w:r>
-          </w:p>
-        </w:tc>
-        <w:tc>
-          <w:tcPr/>
-          <w:p>
-            <w:pPr>
-              <w:pStyle w:val="Compact"/>
-              <w:jc w:val="left"/>
-            </w:pPr>
-            <w:r>
-              <w:t xml:space="preserve">[ ]</w:t>
+              <w:t xml:space="preserve">0.994 ± 0.005</w:t>
+            </w:r>
+          </w:p>
+        </w:tc>
+        <w:tc>
+          <w:tcPr/>
+          <w:p>
+            <w:pPr>
+              <w:pStyle w:val="Compact"/>
+              <w:jc w:val="left"/>
+            </w:pPr>
+            <w:r>
+              <w:t xml:space="preserve">0.994 ± 0.001</w:t>
+            </w:r>
+          </w:p>
+        </w:tc>
+        <w:tc>
+          <w:tcPr/>
+          <w:p>
+            <w:pPr>
+              <w:pStyle w:val="Compact"/>
+              <w:jc w:val="left"/>
+            </w:pPr>
+            <w:r>
+              <w:t xml:space="preserve">0.990 ± 0.003</w:t>
             </w:r>
           </w:p>
         </w:tc>
@@ -1160,48 +1118,56 @@
               <w:jc w:val="left"/>
             </w:pPr>
             <w:r>
-              <w:t xml:space="preserve">EyePACS: ECE and Brier</w:t>
-            </w:r>
-          </w:p>
-        </w:tc>
-        <w:tc>
-          <w:tcPr/>
-          <w:p>
-            <w:pPr>
-              <w:pStyle w:val="Compact"/>
-              <w:jc w:val="left"/>
-            </w:pPr>
-            <w:r>
-              <w:t xml:space="preserve">[ ]</w:t>
-            </w:r>
-          </w:p>
-        </w:tc>
-        <w:tc>
-          <w:tcPr/>
-          <w:p>
-            <w:pPr>
-              <w:pStyle w:val="Compact"/>
-              <w:jc w:val="left"/>
-            </w:pPr>
-            <w:r>
-              <w:t xml:space="preserve">[ ]</w:t>
-            </w:r>
-          </w:p>
-        </w:tc>
-        <w:tc>
-          <w:tcPr/>
-          <w:p>
-            <w:pPr>
-              <w:pStyle w:val="Compact"/>
-              <w:jc w:val="left"/>
-            </w:pPr>
-            <w:r>
-              <w:t xml:space="preserve">[ ]</w:t>
+              <w:t xml:space="preserve">EyePACS: PR-AUC (early vs none)</w:t>
+            </w:r>
+          </w:p>
+        </w:tc>
+        <w:tc>
+          <w:tcPr/>
+          <w:p>
+            <w:pPr>
+              <w:pStyle w:val="Compact"/>
+              <w:jc w:val="left"/>
+            </w:pPr>
+            <w:r>
+              <w:t xml:space="preserve">0.569 ± 0.028</w:t>
+            </w:r>
+          </w:p>
+        </w:tc>
+        <w:tc>
+          <w:tcPr/>
+          <w:p>
+            <w:pPr>
+              <w:pStyle w:val="Compact"/>
+              <w:jc w:val="left"/>
+            </w:pPr>
+            <w:r>
+              <w:t xml:space="preserve">0.800 ± 0.002</w:t>
+            </w:r>
+          </w:p>
+        </w:tc>
+        <w:tc>
+          <w:tcPr/>
+          <w:p>
+            <w:pPr>
+              <w:pStyle w:val="Compact"/>
+              <w:jc w:val="left"/>
+            </w:pPr>
+            <w:r>
+              <w:t xml:space="preserve">0.465 ± 0.019</w:t>
             </w:r>
           </w:p>
         </w:tc>
       </w:tr>
     </w:tbl>
+    <w:p>
+      <w:pPr>
+        <w:pStyle w:val="BodyText"/>
+      </w:pPr>
+      <w:r>
+        <w:t xml:space="preserve">Compared with the same seeds trained on the random DDR split, AUROC changed by at most 0.003 on DDR and APTOS, and rose on EyePACS by 0.019 (A), 0.007 (B) and 0.004 (C). Arm C’s EyePACS AUROC dropped 0.040 for seed 42 but rose 0.027 and 0.024 for seeds 43 and 44, so the seed-42 drop was an outlier. ECE, Brier and patient-level bootstrap intervals are not yet computed.</w:t>
+      </w:r>
+    </w:p>
     <w:bookmarkEnd w:id="25"/>
     <w:bookmarkStart w:id="26" w:name="diagnostic-checks"/>
     <w:p>
@@ -1231,7 +1197,7 @@
         <w:t xml:space="preserve"> </w:t>
       </w:r>
       <w:r>
-        <w:t xml:space="preserve">834 candidate groups; 4% of DDR test images had a near-duplicate in train. A group-aware split removed it and test results did not change beyond seed noise.</w:t>
+        <w:t xml:space="preserve">834 candidate groups; 4% of DDR test images had a near-duplicate in train. A group-aware split removed it; over three seeds AUROC changed by at most 0.003 on DDR and APTOS.</w:t>
       </w:r>
     </w:p>
     <w:p>

</xml_diff>

<commit_message>
Add ECE, Brier and 95% intervals (3 seeds) to decks, report and scripts
Co-Authored-By: Claude Sonnet 5.5 <noreply@anthropic.com>
Claude-Session: https://claude.ai/code/session_01Mrmk7xtGXEASaZHBUGuSEF
</commit_message>
<xml_diff>
--- a/Progress_Report.docx
+++ b/Progress_Report.docx
@@ -166,7 +166,7 @@
         <w:pStyle w:val="FirstParagraph"/>
       </w:pPr>
       <w:r>
-        <w:t xml:space="preserve">This project asks whether models trained on merged diabetic retinopathy (DR) datasets learn the disease or the dataset they came from, for early DR (grades 1-2 versus No DR) at a fixed specificity. The full pipeline runs on Kaggle with three public datasets (DDR, EyePACS, APTOS). Results so far show that a naive merge teaches the source, that a source-balanced merge helps on unseen patients, and that in-domain scores are optimistic. Group-split results are over three seeds; ECE, Brier and patient-level intervals are still to report.</w:t>
+        <w:t xml:space="preserve">This project asks whether models trained on merged diabetic retinopathy (DR) datasets learn the disease or the dataset they came from, for early DR (grades 1-2 versus No DR) at a fixed specificity. The full pipeline runs on Kaggle with three public datasets (DDR, EyePACS, APTOS). Results so far show that a naive merge teaches the source, that a source-balanced merge helps on unseen patients, and that in-domain scores are optimistic. Group-split results are over three seeds, with 95% intervals, ECE and Brier.</w:t>
       </w:r>
     </w:p>
     <w:bookmarkEnd w:id="20"/>
@@ -840,7 +840,7 @@
         <w:t xml:space="preserve"> </w:t>
       </w:r>
       <w:r>
-        <w:t xml:space="preserve">(mean ± sd over seeds 42, 43, 44; group-aware DDR split; EyePACS and APTOS unchanged):</w:t>
+        <w:t xml:space="preserve">(mean over seeds 42, 43, 44, with 95% patient-level bootstrap intervals averaged over seeds; group-aware DDR split; EyePACS and APTOS unchanged):</w:t>
       </w:r>
     </w:p>
     <w:tbl>
@@ -930,31 +930,31 @@
               <w:jc w:val="left"/>
             </w:pPr>
             <w:r>
-              <w:t xml:space="preserve">0.941 ± 0.009</w:t>
-            </w:r>
-          </w:p>
-        </w:tc>
-        <w:tc>
-          <w:tcPr/>
-          <w:p>
-            <w:pPr>
-              <w:pStyle w:val="Compact"/>
-              <w:jc w:val="left"/>
-            </w:pPr>
-            <w:r>
-              <w:t xml:space="preserve">0.925 ± 0.004</w:t>
-            </w:r>
-          </w:p>
-        </w:tc>
-        <w:tc>
-          <w:tcPr/>
-          <w:p>
-            <w:pPr>
-              <w:pStyle w:val="Compact"/>
-              <w:jc w:val="left"/>
-            </w:pPr>
-            <w:r>
-              <w:t xml:space="preserve">0.938 ± 0.005</w:t>
+              <w:t xml:space="preserve">0.941 (0.926-0.955)</w:t>
+            </w:r>
+          </w:p>
+        </w:tc>
+        <w:tc>
+          <w:tcPr/>
+          <w:p>
+            <w:pPr>
+              <w:pStyle w:val="Compact"/>
+              <w:jc w:val="left"/>
+            </w:pPr>
+            <w:r>
+              <w:t xml:space="preserve">0.925 (0.909-0.941)</w:t>
+            </w:r>
+          </w:p>
+        </w:tc>
+        <w:tc>
+          <w:tcPr/>
+          <w:p>
+            <w:pPr>
+              <w:pStyle w:val="Compact"/>
+              <w:jc w:val="left"/>
+            </w:pPr>
+            <w:r>
+              <w:t xml:space="preserve">0.938 (0.923-0.953)</w:t>
             </w:r>
           </w:p>
         </w:tc>
@@ -980,31 +980,31 @@
               <w:jc w:val="left"/>
             </w:pPr>
             <w:r>
-              <w:t xml:space="preserve">0.780 ± 0.006</w:t>
-            </w:r>
-          </w:p>
-        </w:tc>
-        <w:tc>
-          <w:tcPr/>
-          <w:p>
-            <w:pPr>
-              <w:pStyle w:val="Compact"/>
-              <w:jc w:val="left"/>
-            </w:pPr>
-            <w:r>
-              <w:t xml:space="preserve">0.884 ± 0.002</w:t>
-            </w:r>
-          </w:p>
-        </w:tc>
-        <w:tc>
-          <w:tcPr/>
-          <w:p>
-            <w:pPr>
-              <w:pStyle w:val="Compact"/>
-              <w:jc w:val="left"/>
-            </w:pPr>
-            <w:r>
-              <w:t xml:space="preserve">0.717 ± 0.011</w:t>
+              <w:t xml:space="preserve">0.780 (0.762-0.799)</w:t>
+            </w:r>
+          </w:p>
+        </w:tc>
+        <w:tc>
+          <w:tcPr/>
+          <w:p>
+            <w:pPr>
+              <w:pStyle w:val="Compact"/>
+              <w:jc w:val="left"/>
+            </w:pPr>
+            <w:r>
+              <w:t xml:space="preserve">0.884 (0.870-0.897)</w:t>
+            </w:r>
+          </w:p>
+        </w:tc>
+        <w:tc>
+          <w:tcPr/>
+          <w:p>
+            <w:pPr>
+              <w:pStyle w:val="Compact"/>
+              <w:jc w:val="left"/>
+            </w:pPr>
+            <w:r>
+              <w:t xml:space="preserve">0.717 (0.698-0.738)</w:t>
             </w:r>
           </w:p>
         </w:tc>
@@ -1030,31 +1030,31 @@
               <w:jc w:val="left"/>
             </w:pPr>
             <w:r>
-              <w:t xml:space="preserve">0.438 ± 0.019</w:t>
-            </w:r>
-          </w:p>
-        </w:tc>
-        <w:tc>
-          <w:tcPr/>
-          <w:p>
-            <w:pPr>
-              <w:pStyle w:val="Compact"/>
-              <w:jc w:val="left"/>
-            </w:pPr>
-            <w:r>
-              <w:t xml:space="preserve">0.898 ± 0.004</w:t>
-            </w:r>
-          </w:p>
-        </w:tc>
-        <w:tc>
-          <w:tcPr/>
-          <w:p>
-            <w:pPr>
-              <w:pStyle w:val="Compact"/>
-              <w:jc w:val="left"/>
-            </w:pPr>
-            <w:r>
-              <w:t xml:space="preserve">0.008 ± 0.001</w:t>
+              <w:t xml:space="preserve">0.438</w:t>
+            </w:r>
+          </w:p>
+        </w:tc>
+        <w:tc>
+          <w:tcPr/>
+          <w:p>
+            <w:pPr>
+              <w:pStyle w:val="Compact"/>
+              <w:jc w:val="left"/>
+            </w:pPr>
+            <w:r>
+              <w:t xml:space="preserve">0.898</w:t>
+            </w:r>
+          </w:p>
+        </w:tc>
+        <w:tc>
+          <w:tcPr/>
+          <w:p>
+            <w:pPr>
+              <w:pStyle w:val="Compact"/>
+              <w:jc w:val="left"/>
+            </w:pPr>
+            <w:r>
+              <w:t xml:space="preserve">0.008</w:t>
             </w:r>
           </w:p>
         </w:tc>
@@ -1080,31 +1080,31 @@
               <w:jc w:val="left"/>
             </w:pPr>
             <w:r>
-              <w:t xml:space="preserve">0.994 ± 0.005</w:t>
-            </w:r>
-          </w:p>
-        </w:tc>
-        <w:tc>
-          <w:tcPr/>
-          <w:p>
-            <w:pPr>
-              <w:pStyle w:val="Compact"/>
-              <w:jc w:val="left"/>
-            </w:pPr>
-            <w:r>
-              <w:t xml:space="preserve">0.994 ± 0.001</w:t>
-            </w:r>
-          </w:p>
-        </w:tc>
-        <w:tc>
-          <w:tcPr/>
-          <w:p>
-            <w:pPr>
-              <w:pStyle w:val="Compact"/>
-              <w:jc w:val="left"/>
-            </w:pPr>
-            <w:r>
-              <w:t xml:space="preserve">0.990 ± 0.003</w:t>
+              <w:t xml:space="preserve">0.994 (0.991-0.996)</w:t>
+            </w:r>
+          </w:p>
+        </w:tc>
+        <w:tc>
+          <w:tcPr/>
+          <w:p>
+            <w:pPr>
+              <w:pStyle w:val="Compact"/>
+              <w:jc w:val="left"/>
+            </w:pPr>
+            <w:r>
+              <w:t xml:space="preserve">0.994 (0.991-0.996)</w:t>
+            </w:r>
+          </w:p>
+        </w:tc>
+        <w:tc>
+          <w:tcPr/>
+          <w:p>
+            <w:pPr>
+              <w:pStyle w:val="Compact"/>
+              <w:jc w:val="left"/>
+            </w:pPr>
+            <w:r>
+              <w:t xml:space="preserve">0.990 (0.988-0.993)</w:t>
             </w:r>
           </w:p>
         </w:tc>
@@ -1118,43 +1118,143 @@
               <w:jc w:val="left"/>
             </w:pPr>
             <w:r>
-              <w:t xml:space="preserve">EyePACS: PR-AUC (early vs none)</w:t>
-            </w:r>
-          </w:p>
-        </w:tc>
-        <w:tc>
-          <w:tcPr/>
-          <w:p>
-            <w:pPr>
-              <w:pStyle w:val="Compact"/>
-              <w:jc w:val="left"/>
-            </w:pPr>
-            <w:r>
-              <w:t xml:space="preserve">0.569 ± 0.028</w:t>
-            </w:r>
-          </w:p>
-        </w:tc>
-        <w:tc>
-          <w:tcPr/>
-          <w:p>
-            <w:pPr>
-              <w:pStyle w:val="Compact"/>
-              <w:jc w:val="left"/>
-            </w:pPr>
-            <w:r>
-              <w:t xml:space="preserve">0.800 ± 0.002</w:t>
-            </w:r>
-          </w:p>
-        </w:tc>
-        <w:tc>
-          <w:tcPr/>
-          <w:p>
-            <w:pPr>
-              <w:pStyle w:val="Compact"/>
-              <w:jc w:val="left"/>
-            </w:pPr>
-            <w:r>
-              <w:t xml:space="preserve">0.465 ± 0.019</w:t>
+              <w:t xml:space="preserve">EyePACS: ECE / Brier</w:t>
+            </w:r>
+          </w:p>
+        </w:tc>
+        <w:tc>
+          <w:tcPr/>
+          <w:p>
+            <w:pPr>
+              <w:pStyle w:val="Compact"/>
+              <w:jc w:val="left"/>
+            </w:pPr>
+            <w:r>
+              <w:t xml:space="preserve">0.326 / 0.300</w:t>
+            </w:r>
+          </w:p>
+        </w:tc>
+        <w:tc>
+          <w:tcPr/>
+          <w:p>
+            <w:pPr>
+              <w:pStyle w:val="Compact"/>
+              <w:jc w:val="left"/>
+            </w:pPr>
+            <w:r>
+              <w:t xml:space="preserve">0.056 / 0.091</w:t>
+            </w:r>
+          </w:p>
+        </w:tc>
+        <w:tc>
+          <w:tcPr/>
+          <w:p>
+            <w:pPr>
+              <w:pStyle w:val="Compact"/>
+              <w:jc w:val="left"/>
+            </w:pPr>
+            <w:r>
+              <w:t xml:space="preserve">0.717 / 0.707</w:t>
+            </w:r>
+          </w:p>
+        </w:tc>
+      </w:tr>
+      <w:tr>
+        <w:tc>
+          <w:tcPr/>
+          <w:p>
+            <w:pPr>
+              <w:pStyle w:val="Compact"/>
+              <w:jc w:val="left"/>
+            </w:pPr>
+            <w:r>
+              <w:t xml:space="preserve">APTOS: ECE / Brier</w:t>
+            </w:r>
+          </w:p>
+        </w:tc>
+        <w:tc>
+          <w:tcPr/>
+          <w:p>
+            <w:pPr>
+              <w:pStyle w:val="Compact"/>
+              <w:jc w:val="left"/>
+            </w:pPr>
+            <w:r>
+              <w:t xml:space="preserve">0.219 / 0.151</w:t>
+            </w:r>
+          </w:p>
+        </w:tc>
+        <w:tc>
+          <w:tcPr/>
+          <w:p>
+            <w:pPr>
+              <w:pStyle w:val="Compact"/>
+              <w:jc w:val="left"/>
+            </w:pPr>
+            <w:r>
+              <w:t xml:space="preserve">0.082 / 0.046</w:t>
+            </w:r>
+          </w:p>
+        </w:tc>
+        <w:tc>
+          <w:tcPr/>
+          <w:p>
+            <w:pPr>
+              <w:pStyle w:val="Compact"/>
+              <w:jc w:val="left"/>
+            </w:pPr>
+            <w:r>
+              <w:t xml:space="preserve">0.313 / 0.246</w:t>
+            </w:r>
+          </w:p>
+        </w:tc>
+      </w:tr>
+      <w:tr>
+        <w:tc>
+          <w:tcPr/>
+          <w:p>
+            <w:pPr>
+              <w:pStyle w:val="Compact"/>
+              <w:jc w:val="left"/>
+            </w:pPr>
+            <w:r>
+              <w:t xml:space="preserve">DDR: ECE / Brier</w:t>
+            </w:r>
+          </w:p>
+        </w:tc>
+        <w:tc>
+          <w:tcPr/>
+          <w:p>
+            <w:pPr>
+              <w:pStyle w:val="Compact"/>
+              <w:jc w:val="left"/>
+            </w:pPr>
+            <w:r>
+              <w:t xml:space="preserve">0.017 / 0.052</w:t>
+            </w:r>
+          </w:p>
+        </w:tc>
+        <w:tc>
+          <w:tcPr/>
+          <w:p>
+            <w:pPr>
+              <w:pStyle w:val="Compact"/>
+              <w:jc w:val="left"/>
+            </w:pPr>
+            <w:r>
+              <w:t xml:space="preserve">0.027 / 0.051</w:t>
+            </w:r>
+          </w:p>
+        </w:tc>
+        <w:tc>
+          <w:tcPr/>
+          <w:p>
+            <w:pPr>
+              <w:pStyle w:val="Compact"/>
+              <w:jc w:val="left"/>
+            </w:pPr>
+            <w:r>
+              <w:t xml:space="preserve">0.017 / 0.053</w:t>
             </w:r>
           </w:p>
         </w:tc>
@@ -1165,17 +1265,7 @@
         <w:pStyle w:val="BodyText"/>
       </w:pPr>
       <w:r>
-        <w:t xml:space="preserve">Compared with the same seeds trained on the random DDR split, AUROC changed by at most 0.003 on DDR and APTOS, and rose on EyePACS by 0.019 (A), 0.007 (B) and 0.004 (C). Arm C’s EyePACS AUROC dropped 0.040 for seed 42 but rose 0.027 and 0.024 for seeds 43 and 44, so the seed-42 drop was an outlier. ECE, Brier and patient-level bootstrap intervals are not yet computed.</w:t>
-      </w:r>
-    </w:p>
-    <w:bookmarkEnd w:id="25"/>
-    <w:bookmarkStart w:id="26" w:name="diagnostic-checks"/>
-    <w:p>
-      <w:pPr>
-        <w:pStyle w:val="Heading2"/>
-      </w:pPr>
-      <w:r>
-        <w:t xml:space="preserve">5.3 Diagnostic checks</w:t>
+        <w:t xml:space="preserve">ECE and Brier measure any DR vs No DR on all grades, after temperature scaling and prior-shift correction (lower is better); the intervals describe image-sampling noise, while the AUROC spread across seeds is small (sd 0.001 to 0.011).</w:t>
       </w:r>
     </w:p>
     <w:p>
@@ -1191,13 +1281,13 @@
           <w:bCs/>
           <w:b/>
         </w:rPr>
-        <w:t xml:space="preserve">Duplicates.</w:t>
-      </w:r>
-      <w:r>
-        <w:t xml:space="preserve"> </w:t>
-      </w:r>
-      <w:r>
-        <w:t xml:space="preserve">834 candidate groups; 4% of DDR test images had a near-duplicate in train. A group-aware split removed it; over three seeds AUROC changed by at most 0.003 on DDR and APTOS.</w:t>
+        <w:t xml:space="preserve">EyePACS:</w:t>
+      </w:r>
+      <w:r>
+        <w:t xml:space="preserve"> </w:t>
+      </w:r>
+      <w:r>
+        <w:t xml:space="preserve">the AUROC intervals of the three arms do not overlap, and arm B is clearly best (0.884). Arm C’s Brier score of 0.707 is worse than predicting the same probability for every image (about 0.25), because it flags nearly everything.</w:t>
       </w:r>
     </w:p>
     <w:p>
@@ -1213,13 +1303,13 @@
           <w:bCs/>
           <w:b/>
         </w:rPr>
-        <w:t xml:space="preserve">Image properties (first step of RQ3).</w:t>
-      </w:r>
-      <w:r>
-        <w:t xml:space="preserve"> </w:t>
-      </w:r>
-      <w:r>
-        <w:t xml:space="preserve">Image size alone predicts early DR at AUROC 0.96 in APTOS, 0.58 in DDR and 0.53 in EyePACS, so APTOS is camera-confounded and EyePACS is the cleanest benchmark. Within groups of APTOS images of the same size the models still score AUROC 0.984-0.989 (post-hoc), so size alone does not explain the APTOS score.</w:t>
+        <w:t xml:space="preserve">Calibration does not transfer either:</w:t>
+      </w:r>
+      <w:r>
+        <w:t xml:space="preserve"> </w:t>
+      </w:r>
+      <w:r>
+        <w:t xml:space="preserve">ECE is small on DDR (0.017 to 0.027) but 0.326 (A) and 0.717 (C) on EyePACS; arm B stays at 0.056.</w:t>
       </w:r>
     </w:p>
     <w:p>
@@ -1235,24 +1325,67 @@
           <w:bCs/>
           <w:b/>
         </w:rPr>
-        <w:t xml:space="preserve">Strong augmentation.</w:t>
-      </w:r>
-      <w:r>
-        <w:t xml:space="preserve"> </w:t>
-      </w:r>
-      <w:r>
-        <w:t xml:space="preserve">The failure was a BatchNorm train/eval mismatch from the noise and blur part. Geometric augmentation on all classes scores 0.977; on minority classes only it scores 0.834, because it leaks the label.</w:t>
-      </w:r>
-    </w:p>
-    <w:bookmarkEnd w:id="26"/>
-    <w:bookmarkEnd w:id="27"/>
-    <w:bookmarkStart w:id="28" w:name="limitations"/>
-    <w:p>
-      <w:pPr>
-        <w:pStyle w:val="Heading1"/>
-      </w:pPr>
-      <w:r>
-        <w:t xml:space="preserve">6. Limitations</w:t>
+        <w:t xml:space="preserve">DDR:</w:t>
+      </w:r>
+      <w:r>
+        <w:t xml:space="preserve"> </w:t>
+      </w:r>
+      <w:r>
+        <w:t xml:space="preserve">all arms overlap (AUROC 0.976 to 0.980), so adding EyePACS neither helps nor hurts there.</w:t>
+      </w:r>
+    </w:p>
+    <w:p>
+      <w:pPr>
+        <w:numPr>
+          <w:ilvl w:val="0"/>
+          <w:numId w:val="1004"/>
+        </w:numPr>
+        <w:pStyle w:val="Compact"/>
+      </w:pPr>
+      <w:r>
+        <w:rPr>
+          <w:bCs/>
+          <w:b/>
+        </w:rPr>
+        <w:t xml:space="preserve">Group vs random split:</w:t>
+      </w:r>
+      <w:r>
+        <w:t xml:space="preserve"> </w:t>
+      </w:r>
+      <w:r>
+        <w:t xml:space="preserve">the intervals overlap for every arm and source, consistent with the earlier conclusion that near-duplicate leakage does not explain the DDR scores.</w:t>
+      </w:r>
+    </w:p>
+    <w:p>
+      <w:pPr>
+        <w:numPr>
+          <w:ilvl w:val="0"/>
+          <w:numId w:val="1004"/>
+        </w:numPr>
+        <w:pStyle w:val="Compact"/>
+      </w:pPr>
+      <w:r>
+        <w:rPr>
+          <w:bCs/>
+          <w:b/>
+        </w:rPr>
+        <w:t xml:space="preserve">Own-test sets:</w:t>
+      </w:r>
+      <w:r>
+        <w:t xml:space="preserve"> </w:t>
+      </w:r>
+      <w:r>
+        <w:t xml:space="preserve">arm C’s in-domain AUROC on its merged test set is 0.981 against 0.929 for arm B, but these test sets differ by arm, so they are not comparable.</w:t>
+      </w:r>
+    </w:p>
+    <w:bookmarkEnd w:id="25"/>
+    <w:bookmarkStart w:id="26" w:name="diagnostic-checks"/>
+    <w:p>
+      <w:pPr>
+        <w:pStyle w:val="Heading2"/>
+      </w:pPr>
+      <w:r>
+        <w:t xml:space="preserve">5.3 Diagnostic checks</w:t>
       </w:r>
     </w:p>
     <w:p>
@@ -1264,7 +1397,17 @@
         <w:pStyle w:val="Compact"/>
       </w:pPr>
       <w:r>
-        <w:t xml:space="preserve">The frozen threshold does not transfer across datasets, so sensitivity alone is misleading off-domain; compare AUROC.</w:t>
+        <w:rPr>
+          <w:bCs/>
+          <w:b/>
+        </w:rPr>
+        <w:t xml:space="preserve">Duplicates.</w:t>
+      </w:r>
+      <w:r>
+        <w:t xml:space="preserve"> </w:t>
+      </w:r>
+      <w:r>
+        <w:t xml:space="preserve">834 candidate groups; 4% of DDR test images had a near-duplicate in train. A group-aware split removed it; over three seeds AUROC changed by at most 0.003 on DDR and APTOS.</w:t>
       </w:r>
     </w:p>
     <w:p>
@@ -1276,7 +1419,17 @@
         <w:pStyle w:val="Compact"/>
       </w:pPr>
       <w:r>
-        <w:t xml:space="preserve">APTOS may carry other capture cues beyond image size.</w:t>
+        <w:rPr>
+          <w:bCs/>
+          <w:b/>
+        </w:rPr>
+        <w:t xml:space="preserve">Image properties (first step of RQ3).</w:t>
+      </w:r>
+      <w:r>
+        <w:t xml:space="preserve"> </w:t>
+      </w:r>
+      <w:r>
+        <w:t xml:space="preserve">Image size alone predicts early DR at AUROC 0.96 in APTOS, 0.58 in DDR and 0.53 in EyePACS, so APTOS is camera-confounded and EyePACS is the cleanest benchmark. Within groups of APTOS images of the same size the models still score AUROC 0.984-0.989 (post-hoc), so size alone does not explain the APTOS score.</w:t>
       </w:r>
     </w:p>
     <w:p>
@@ -1288,26 +1441,83 @@
         <w:pStyle w:val="Compact"/>
       </w:pPr>
       <w:r>
-        <w:t xml:space="preserve">DDR has no patient IDs, so same-patient leakage cannot be tested.</w:t>
+        <w:rPr>
+          <w:bCs/>
+          <w:b/>
+        </w:rPr>
+        <w:t xml:space="preserve">Strong augmentation.</w:t>
+      </w:r>
+      <w:r>
+        <w:t xml:space="preserve"> </w:t>
+      </w:r>
+      <w:r>
+        <w:t xml:space="preserve">The failure was a BatchNorm train/eval mismatch from the noise and blur part. Geometric augmentation on all classes scores 0.977; on minority classes only it scores 0.834, because it leaks the label.</w:t>
+      </w:r>
+    </w:p>
+    <w:bookmarkEnd w:id="26"/>
+    <w:bookmarkEnd w:id="27"/>
+    <w:bookmarkStart w:id="28" w:name="limitations"/>
+    <w:p>
+      <w:pPr>
+        <w:pStyle w:val="Heading1"/>
+      </w:pPr>
+      <w:r>
+        <w:t xml:space="preserve">6. Limitations</w:t>
       </w:r>
     </w:p>
     <w:p>
       <w:pPr>
         <w:numPr>
           <w:ilvl w:val="0"/>
-          <w:numId w:val="1005"/>
+          <w:numId w:val="1006"/>
         </w:numPr>
         <w:pStyle w:val="Compact"/>
       </w:pPr>
       <w:r>
-        <w:t xml:space="preserve">Per-grade, specificity and image-size analyses were added after seeing the data and are post-hoc.</w:t>
+        <w:t xml:space="preserve">The frozen threshold does not transfer across datasets, so sensitivity alone is misleading off-domain; compare AUROC.</w:t>
       </w:r>
     </w:p>
     <w:p>
       <w:pPr>
         <w:numPr>
           <w:ilvl w:val="0"/>
-          <w:numId w:val="1005"/>
+          <w:numId w:val="1006"/>
+        </w:numPr>
+        <w:pStyle w:val="Compact"/>
+      </w:pPr>
+      <w:r>
+        <w:t xml:space="preserve">APTOS may carry other capture cues beyond image size.</w:t>
+      </w:r>
+    </w:p>
+    <w:p>
+      <w:pPr>
+        <w:numPr>
+          <w:ilvl w:val="0"/>
+          <w:numId w:val="1006"/>
+        </w:numPr>
+        <w:pStyle w:val="Compact"/>
+      </w:pPr>
+      <w:r>
+        <w:t xml:space="preserve">DDR has no patient IDs, so same-patient leakage cannot be tested.</w:t>
+      </w:r>
+    </w:p>
+    <w:p>
+      <w:pPr>
+        <w:numPr>
+          <w:ilvl w:val="0"/>
+          <w:numId w:val="1006"/>
+        </w:numPr>
+        <w:pStyle w:val="Compact"/>
+      </w:pPr>
+      <w:r>
+        <w:t xml:space="preserve">Per-grade, specificity and image-size analyses were added after seeing the data and are post-hoc.</w:t>
+      </w:r>
+    </w:p>
+    <w:p>
+      <w:pPr>
+        <w:numPr>
+          <w:ilvl w:val="0"/>
+          <w:numId w:val="1006"/>
         </w:numPr>
         <w:pStyle w:val="Compact"/>
       </w:pPr>
@@ -1942,6 +2152,9 @@
     <w:abstractNumId w:val="991"/>
   </w:num>
   <w:num w:numId="1005">
+    <w:abstractNumId w:val="991"/>
+  </w:num>
+  <w:num w:numId="1006">
     <w:abstractNumId w:val="991"/>
   </w:num>
 </w:numbering>

</xml_diff>